<commit_message>
feat: DDPM+EGNN guided diffusion + experimental condition support
New:
- circrna_diffusion.py: DDPM + EGNN denoiser + BSJ closure guided diffusion
- experimental_conditions.py: pH, Mg2+, temperature, ionic strength encoding

Updated:
- conditional_diffusion.py: added exp_condition_emb + classifier-free guidance
- benchmark_schemes.py: uses new CircRNADiffusionModel
- manuscript: transfer learning results + experimental condition support

Co-Authored-By: Claude Opus 4.6 <noreply@anthropic.com>
</commit_message>
<xml_diff>
--- a/manuscripts/figures/confluencia_3.0_manuscript_final.docx
+++ b/manuscripts/figures/confluencia_3.0_manuscript_final.docx
@@ -7173,7 +7173,95 @@
         </m:sSup>
       </m:oMath>
       <w:r>
-        <w:t xml:space="preserve">). The model (3.2M parameters, 12.9MB) trains in 3 minutes on CPU with early stopping at epoch 44, compared to AlphaFold2’s 93M parameters requiring GPU clusters. This allows the model to learn circular topology from available secondary structure data while preparing the architecture for 3D prediction when circRNA-CASP data becomes available. Note: TorusFold does not compete with secondary structure predictors; it leverages them as pseudo-label sources for 3D prediction. TorusFold and IsRNAcirc</w:t>
+        <w:t xml:space="preserve">). The model (3.2M parameters, 12.9MB) trains in 3 minutes on CPU with early stopping at epoch 44, compared to AlphaFold2’s 93M parameters requiring GPU clusters.</w:t>
+      </w:r>
+      <w:r>
+        <w:t xml:space="preserve"> </w:t>
+      </w:r>
+      <w:r>
+        <w:rPr>
+          <w:b/>
+          <w:bCs/>
+        </w:rPr>
+        <w:t xml:space="preserve">Experimental condition support:</w:t>
+      </w:r>
+      <w:r>
+        <w:t xml:space="preserve"> </w:t>
+      </w:r>
+      <w:r>
+        <w:t xml:space="preserve">The conditional diffusion variant (Scheme 4) uses DDPM + EGNN with classifier-free guidance, enabling structure prediction conditioned on experimental parameters (temperature, pH, Mg</w:t>
+      </w:r>
+      <m:oMath>
+        <m:sSup>
+          <m:e>
+            <m:r>
+              <m:t>​</m:t>
+            </m:r>
+          </m:e>
+          <m:sup>
+            <m:r>
+              <m:t>2</m:t>
+            </m:r>
+            <m:r>
+              <m:rPr>
+                <m:sty m:val="p"/>
+              </m:rPr>
+              <m:t>+</m:t>
+            </m:r>
+          </m:sup>
+        </m:sSup>
+      </m:oMath>
+      <w:r>
+        <w:t xml:space="preserve">, ionic strength). A circRNA-specific BSJ closure reward function provides guided diffusion, forcing generated structures toward circular topology during denoising. This allows users to predict how circRNA structure changes under different experimental conditions (e.g., low Mg</w:t>
+      </w:r>
+      <m:oMath>
+        <m:sSup>
+          <m:e>
+            <m:r>
+              <m:t>​</m:t>
+            </m:r>
+          </m:e>
+          <m:sup>
+            <m:r>
+              <m:t>2</m:t>
+            </m:r>
+            <m:r>
+              <m:rPr>
+                <m:sty m:val="p"/>
+              </m:rPr>
+              <m:t>+</m:t>
+            </m:r>
+          </m:sup>
+        </m:sSup>
+      </m:oMath>
+      <w:r>
+        <w:t xml:space="preserve"> </w:t>
+      </w:r>
+      <w:r>
+        <w:t xml:space="preserve">vs. physiological Mg</w:t>
+      </w:r>
+      <m:oMath>
+        <m:sSup>
+          <m:e>
+            <m:r>
+              <m:t>​</m:t>
+            </m:r>
+          </m:e>
+          <m:sup>
+            <m:r>
+              <m:t>2</m:t>
+            </m:r>
+            <m:r>
+              <m:rPr>
+                <m:sty m:val="p"/>
+              </m:rPr>
+              <m:t>+</m:t>
+            </m:r>
+          </m:sup>
+        </m:sSup>
+      </m:oMath>
+      <w:r>
+        <w:t xml:space="preserve">, acidic vs. neutral pH). This allows the model to learn circular topology from available secondary structure data while preparing the architecture for 3D prediction when circRNA-CASP data becomes available. Note: TorusFold does not compete with secondary structure predictors; it leverages them as pseudo-label sources for 3D prediction. TorusFold and IsRNAcirc</w:t>
       </w:r>
       <w:r>
         <w:t xml:space="preserve"> </w:t>

</xml_diff>

<commit_message>
feat: domain-informed scheme updates
Scheme 3: CS-Fold gradient feedback + PaxNet multiplex scoring
- BSJClosurePenalty: hard training penalty (micro path)
- PaxNetScorer: local/non-local/BSJ multiplex graph + gradient feedback

Scheme 4: DDPM+EGNN+guided diffusion (DynaRNA paradigm)
- BSJ closure reward function for guided sampling
- Experimental condition conditioning (T, pH, Mg2+, ionic strength)

Manuscript: domain references for all 6 schemes
- Vfold@CASP16, RNAbpFlow, CS-Fold, DynaRNA, PaxNet

Co-Authored-By: Claude Opus 4.6 <noreply@anthropic.com>
</commit_message>
<xml_diff>
--- a/manuscripts/figures/confluencia_3.0_manuscript_final.docx
+++ b/manuscripts/figures/confluencia_3.0_manuscript_final.docx
@@ -9177,7 +9177,30 @@
         <w:t xml:space="preserve"> </w:t>
       </w:r>
       <w:r>
-        <w:t xml:space="preserve">: gradually cooling from 500K to 300K while perturbing positions near the back-splice junction, allowing the structure to find a low-strain closure path rather than forcing geometric correction. We implement six structural prediction schemes for comparison: (1) DL prediction + physics refinement cascade; (2) batch generation + extended physics scoring (bond, pair, clash, stacking, electrostatic, dihedral); (3) dual-engine iterative evolution (Generator + Selector + Feedback); (4) conditional diffusion with circRNA topology encoding; (5) physics constraint embedding in CircPairformer attention bias; (6) diffusion + GNN hybrid for physics-aware decoding. Schemes 1-2 are production-ready; schemes 3-6 are experimental extensions pending validation. Diffusion-based structure head awaits circRNA-CASP data. TorusFold targets 3D atomic coordinate prediction, a distinct task from secondary structure prediction; it leverages existing tools as pseudo-label sources rather than competing with them. Harmonics</w:t>
+        <w:t xml:space="preserve">: gradually cooling from 500K to 300K while perturbing positions near the back-splice junction, allowing the structure to find a low-strain closure path rather than forcing geometric correction. We implement six structural prediction schemes for comparison: (1) DL prediction + physics refinement cascade, following the Vfold@CASP16 hybrid approach (AF3 generation + IsRNA physics refinement); (2) batch generation + extended physics scoring with DFIRE-RNA/rsRNASP-style statistical potentials (bond, pair, clash, stacking, electrostatic, dihedral), analogous to RNAbpFlow’s ensemble sampling + energy filtering; (3) dual-engine iterative evolution with two paths: macro (genetic algorithm on structure level, crossover/mutation of top-scoring candidates) and micro (CS-Fold-inspired gradient feedback where BSJ closure penalty trains G to inherently generate closed structures); (4) conditional diffusion (DDPM + EGNN) with circRNA-specific BSJ closure guided diffusion and experimental condition conditioning (temperature, pH, Mg</w:t>
+      </w:r>
+      <m:oMath>
+        <m:sSup>
+          <m:e>
+            <m:r>
+              <m:t>​</m:t>
+            </m:r>
+          </m:e>
+          <m:sup>
+            <m:r>
+              <m:t>2</m:t>
+            </m:r>
+            <m:r>
+              <m:rPr>
+                <m:sty m:val="p"/>
+              </m:rPr>
+              <m:t>+</m:t>
+            </m:r>
+          </m:sup>
+        </m:sSup>
+      </m:oMath>
+      <w:r>
+        <w:t xml:space="preserve">, ionic strength), following the DynaRNA paradigm; (5) physics constraint embedding via PaxNet-inspired multiplex graph scoring (local layer for bond/angle + non-local layer for vdW/electrostatic + BSJ edge for circular topology) integrated as CircPairformer attention bias; (6) GNN latent diffusion with physics-aware encoder/decoder. Schemes 1-2 are production-ready; schemes 3-6 are experimental extensions pending validation. Diffusion-based structure head awaits circRNA-CASP data. TorusFold targets 3D atomic coordinate prediction, a distinct task from secondary structure prediction; it leverages existing tools as pseudo-label sources rather than competing with them. Harmonics</w:t>
       </w:r>
       <w:r>
         <w:t xml:space="preserve"> </w:t>

</xml_diff>